<commit_message>
PRAG-GO with the geolocated boundary: 48 000-realization check, paper update
fk_prag_geo_check.py re-estimates the 5-well results with 48 000 inner
realizations (effective sample 77 instead of about 20): the best designs
are unchanged; PRAG-GO reaches 99.6-99.7 % of the best design for the two
supply-well goals, the area design of the published pipeline 69 % and 48 %.

Manuscript: Table 5 (PRAG-GO row and caption), Sections 3.6, 4.6 and 5.2.
Supplement: new Section S7.2b with Fig. S2 and Tables S12-S13; S7 intro,
file list and reproduction map. READMEs updated.

Co-Authored-By: Claude Opus 5.5 <noreply@anthropic.com>
Claude-Session: https://claude.ai/code/session_016Cdcj2FTAQGBVsJUyYJR2M
</commit_message>
<xml_diff>
--- a/docs/manuscript/Chloride_Fushe_Kuqe_Manuscript.docx
+++ b/docs/manuscript/Chloride_Fushe_Kuqe_Manuscript.docx
@@ -6757,7 +6757,7 @@
         <w:t xml:space="preserve">c</w:t>
       </w:r>
       <w:r>
-        <w:t xml:space="preserve"> = 3651 m³/d, driven where needed by recharge fluctuations modelled as an Ornstein–Uhlenbeck process with correlation time 0.5 yr; the threshold-risk design also used the Henry problem and the companion field model, and the information-flow modules a simulated field of 200 000 wells operated over 10 years. The central quantity of each module is stated below; Table 5 gives the test results and the Supplementary Material the models, the experiments and the full results.</w:t>
+        <w:t xml:space="preserve"> = 3651 m³/d, driven where needed by recharge fluctuations modelled as an Ornstein–Uhlenbeck process with correlation time 0.5 yr; the threshold-risk design also used the Henry problem and the companion field model with the geolocated sea boundary, and the information-flow modules a simulated field of 200 000 wells operated over 10 years. The central quantity of each module is stated below; Table 5 gives the test results and the Supplementary Material the models, the experiments and the full results.</w:t>
       </w:r>
     </w:p>
     <w:p>
@@ -11933,7 +11933,7 @@
         <w:jc w:val="both"/>
       </w:pPr>
       <w:r>
-        <w:t xml:space="preserve">For threshold risk, a design built on the adjoint of the exceedance indicator reached 97–100 % of the optimal information on Henry's problem and 92–94 % on the companion field model (three wells, full-margin sea boundary), against 75–96 % for a design built for the salt mass and 23–36 % for one built for the intruded area. Recomputed with the geolocated sea boundary, where the risk comes from pumping at the well field, recharge at three PRAG-MAR sites (5000 m³/d each) lowers the probability that one of two pumped supply wells is intruded from 0.56 to 0.06, close to the exact optimum (0.04); sites chosen for the intruded area reach 0.30, and the published sites, two of which lie in the southern plain without sea contact, 0.53 (Supplementary Section S7.2a and Fig. S1). For tipping, the logger position that maximizes information on the recovery rate (1200 m from the coast, inside the range of the critical toe) predicts warning skill with ρ</w:t>
+        <w:t xml:space="preserve">For threshold risk, a design built on the adjoint of the exceedance indicator reached 97–100 % of the optimal information on Henry's problem, against 75–96 % for a design built for the salt mass. On the field model with the geolocated sea boundary, where the risk comes from pumping two wells of the Fushë-Kuqe field, the three-well design for the supply-well risk reaches 100 % of the optimal information about the risk, whereas the design built for the intruded area, as in the published pipeline, reaches 52–74 % (100 % against 48–69 % with five wells; Supplementary Section S7.2b and Fig. S2). Recomputed with the geolocated sea boundary, where the risk comes from pumping at the well field, recharge at three PRAG-MAR sites (5000 m³/d each) lowers the probability that one of two pumped supply wells is intruded from 0.56 to 0.06, close to the exact optimum (0.04); sites chosen for the intruded area reach 0.30, and the published sites, two of which lie in the southern plain without sea contact, 0.53 (Supplementary Section S7.2a and Fig. S1). For tipping, the logger position that maximizes information on the recovery rate (1200 m from the coast, inside the range of the critical toe) predicts warning skill with ρ</w:t>
       </w:r>
       <w:r>
         <w:rPr>
@@ -12135,7 +12135,7 @@
           <w:sz w:val="20"/>
           <w:szCs w:val="20"/>
         </w:rPr>
-        <w:t xml:space="preserve"> Decision modules: question, test and main result. All tests use models parameterized for Fushë-Kuqe with a known truth; full descriptions are in Supplementary Section S7. PRAG-GO used the companion model with its full-margin sea boundary; PRAG-MAR was recomputed with the geolocated boundary of Section 2.3.</w:t>
+        <w:t xml:space="preserve"> Decision modules: question, test and main result. All tests use models parameterized for Fushë-Kuqe with a known truth; full descriptions are in Supplementary Section S7. The field tests of PRAG-GO and PRAG-MAR use the companion model with the geolocated sea boundary of Section 2.3.</w:t>
       </w:r>
     </w:p>
     <w:tbl>
@@ -12387,7 +12387,7 @@
                 <w:sz w:val="17"/>
                 <w:szCs w:val="17"/>
               </w:rPr>
-              <w:t xml:space="preserve">Henry problem; companion field model</w:t>
+              <w:t xml:space="preserve">Henry problem; companion physics with the geolocated sea boundary, two pumped supply wells</w:t>
             </w:r>
           </w:p>
         </w:tc>
@@ -12419,7 +12419,7 @@
                 <w:sz w:val="17"/>
                 <w:szCs w:val="17"/>
               </w:rPr>
-              <w:t xml:space="preserve">Threshold-goal design reaches 97–100 % (Henry) and 92–94 % (field, three wells) of the optimal EIG; salt-mass (Henry) and area (field) designs reach 75–96 % and 23–36 %.</w:t>
+              <w:t xml:space="preserve">Threshold-goal design reaches 97–100 % (Henry) and 100 % (field, three wells; 100 % with five) of the optimal EIG; salt-mass (Henry) and intruded-area (field) designs reach 75–96 % and 52–74 % (48–69 % with five).</w:t>
             </w:r>
           </w:p>
         </w:tc>
@@ -14243,7 +14243,7 @@
         <w:jc w:val="both"/>
       </w:pPr>
       <w:r>
-        <w:t xml:space="preserve">The geolocated shoreline refines the boundary of the companion study (Zeqiraj, 2026), which placed a seaward boundary along the whole western margin of the aquifer polygon. That choice was stated as an assumption, and it does not affect the methods of that paper (the discrete adjoint, the goal-oriented criterion and its closed form, the facies poolability), which are used again here. It does affect the site-specific design. Along the southern 29 km of the margin the aquifer meets the hills behind Lalëz Bay, not the sea, and the chloride maps show no intrusion there. Design recommendations of the companion study that rely on southern sea contact must be recomputed with the boundary of Section 2.3, and the recharge design shows why. With the full-margin boundary the companion model has an intruded area of 92.7 km² and supply wells at risk without any pumping. With the geolocated boundary and the same physics the intruded area is 10.1 km², confined to the northern coast, no well is at risk unless it is pumped, and two of the three published recharge sites lie in the southern plain, which has no sea contact. Recomputed for two pumped wells of the Fushë-Kuqe well field, PRAG-MAR still outperforms siting for the intruded area (Section 4.6), but its sites move to the well field and to inland cells up-gradient of it (Supplementary Fig. S1). The chloride goal of this paper places the information in the north-western coastal strip instead (Section 4.5). The general lesson is that a goal-oriented design inherits every boundary assumption of the model, and the boundary should be checked against independent geographic data before a design is recommended.</w:t>
+        <w:t xml:space="preserve">The geolocated shoreline refines the boundary of the companion study (Zeqiraj, 2026), which placed a seaward boundary along the whole western margin of the aquifer polygon. That choice was stated as an assumption, and it does not affect the methods of that paper (the discrete adjoint, the goal-oriented criterion and its closed form, the facies poolability), which are used again here. It does affect the site-specific design. Along the southern 29 km of the margin the aquifer meets the hills behind Lalëz Bay, not the sea, and the chloride maps show no intrusion there. Design recommendations of the companion study that rely on southern sea contact must be recomputed with the boundary of Section 2.3, and the recharge design shows why. With the full-margin boundary the companion model has an intruded area of 92.7 km² and supply wells at risk without any pumping. With the geolocated boundary and the same physics the intruded area is 10.1 km², confined to the northern coast, no well is at risk unless it is pumped, and two of the three published recharge sites lie in the southern plain, which has no sea contact. Recomputed for two pumped wells of the Fushë-Kuqe well field, the threshold-risk designs keep their advantage over designs for the intruded area, for monitoring as for recharge (Section 4.6), but their wells and sites move to the well field and to inland cells up-gradient of it (Supplementary Figs. S1 and S2). The chloride goal of this paper places the information in the north-western coastal strip instead (Section 4.5). The general lesson is that a goal-oriented design inherits every boundary assumption of the model, and the boundary should be checked against independent geographic data before a design is recommended.</w:t>
       </w:r>
     </w:p>
     <w:p>
@@ -14643,7 +14643,7 @@
       <w:r>
         <w:t xml:space="preserve">The data workbook (aquifer polygon, well list, hydraulic conductivities, DRASTIC parameters and the compiled water chemistry) is the property of the Albanian Geological Survey and A. Beqiraj and is redistributed with their permission in the code repository; the water-chemistry data are published in Cenameri and Beqiraj (2016). The MATLAB and Python code, the derived inputs and all results are available at </w:t>
       </w:r>
-      <w:hyperlink w:history="1" r:id="rId07kbvpjoh6rgehoxb1vlf">
+      <w:hyperlink w:history="1" r:id="rId5lusyreoxm75-3wneawam">
         <w:r>
           <w:rPr>
             <w:color w:val="1D4ED8"/>
@@ -14747,7 +14747,7 @@
         </w:rPr>
         <w:t xml:space="preserve">Abarca, E., Carrera, J., Sánchez-Vila, X., Dentz, M., 2007. Anisotropic dispersive Henry problem. Adv. Water Resour. 30 (4), 913–926. </w:t>
       </w:r>
-      <w:hyperlink w:history="1" r:id="rIdzhbpbwd1tgaqqbhxzyr7s">
+      <w:hyperlink w:history="1" r:id="rIdhlbpo6hnm1oc8ykmpnhy8">
         <w:r>
           <w:rPr>
             <w:color w:val="1D4ED8"/>
@@ -14772,7 +14772,7 @@
         </w:rPr>
         <w:t xml:space="preserve">Alexanderian, A., 2021. Optimal experimental design for infinite-dimensional Bayesian inverse problems governed by PDEs: A review. Inverse Probl. 37 (4), 043001. </w:t>
       </w:r>
-      <w:hyperlink w:history="1" r:id="rId2pz_glkmxm8m7d7retiyg">
+      <w:hyperlink w:history="1" r:id="rIdtsqxkhuea7-no0pndvkkq">
         <w:r>
           <w:rPr>
             <w:color w:val="1D4ED8"/>
@@ -14811,7 +14811,7 @@
         </w:rPr>
         <w:t xml:space="preserve">Appelo, C.A.J., Postma, D., 2005. Geochemistry, Groundwater and Pollution, second ed. A.A. Balkema, Leiden. </w:t>
       </w:r>
-      <w:hyperlink w:history="1" r:id="rIdikrjwcctqjd2ecpowxpgj">
+      <w:hyperlink w:history="1" r:id="rIdnfiui5yvwxmy2tfbygylv">
         <w:r>
           <w:rPr>
             <w:color w:val="1D4ED8"/>
@@ -14836,7 +14836,7 @@
         </w:rPr>
         <w:t xml:space="preserve">Artegiani, A., Bregant, D., Paschini, E., Pinardi, N., Raicich, F., Russo, A., 1997. The Adriatic Sea general circulation. Part I: Air–sea interactions and water mass structure. J. Phys. Oceanogr. 27 (8), 1492–1514. </w:t>
       </w:r>
-      <w:hyperlink w:history="1" r:id="rIdgpbmrehoy-j6xtplabmbp">
+      <w:hyperlink w:history="1" r:id="rIdrvnf54n4ecbnmsmc6jz3u">
         <w:r>
           <w:rPr>
             <w:color w:val="1D4ED8"/>
@@ -14861,7 +14861,7 @@
         </w:rPr>
         <w:t xml:space="preserve">Attia, A., Alexanderian, A., Saibaba, A.K., 2018. Goal-oriented optimal design of experiments for large-scale Bayesian linear inverse problems. Inverse Probl. 34 (9), 095009. </w:t>
       </w:r>
-      <w:hyperlink w:history="1" r:id="rIdyfoc7q8gmorj2mlvexfyg">
+      <w:hyperlink w:history="1" r:id="rIdffjdddl4nzmdzkigmqe3i">
         <w:r>
           <w:rPr>
             <w:color w:val="1D4ED8"/>
@@ -14886,7 +14886,7 @@
         </w:rPr>
         <w:t xml:space="preserve">Ay, N., Polani, D., 2008. Information flows in causal networks. Adv. Complex Syst. 11 (1), 17–41. </w:t>
       </w:r>
-      <w:hyperlink w:history="1" r:id="rIdq6agewguvfnlfm6yzvxq4">
+      <w:hyperlink w:history="1" r:id="rId58qfpy3j1squvygkri_im">
         <w:r>
           <w:rPr>
             <w:color w:val="1D4ED8"/>
@@ -14911,7 +14911,7 @@
         </w:rPr>
         <w:t xml:space="preserve">Bertschinger, N., Rauh, J., Olbrich, E., Jost, J., Ay, N., 2014. Quantifying unique information. Entropy 16 (4), 2161–2183. </w:t>
       </w:r>
-      <w:hyperlink w:history="1" r:id="rIddasgsehhlerosgjqigme1">
+      <w:hyperlink w:history="1" r:id="rId9s3c9pd0jnaknonho9a0z">
         <w:r>
           <w:rPr>
             <w:color w:val="1D4ED8"/>
@@ -14936,7 +14936,7 @@
         </w:rPr>
         <w:t xml:space="preserve">Cenameri, S., Beqiraj, A., 2016. Assessment of seawater intrusion in Fushe Kuqe aquifer, Albania. Bull. Geol. Soc. Greece 50 (2), 665–670. </w:t>
       </w:r>
-      <w:hyperlink w:history="1" r:id="rIdr-7lol8v7lvwssp7tmtgt">
+      <w:hyperlink w:history="1" r:id="rIdr5vhowf6nslhq5eit0qgq">
         <w:r>
           <w:rPr>
             <w:color w:val="1D4ED8"/>
@@ -14961,7 +14961,7 @@
         </w:rPr>
         <w:t xml:space="preserve">Chaloner, K., Verdinelli, I., 1995. Bayesian experimental design: A review. Stat. Sci. 10 (3), 273–304. </w:t>
       </w:r>
-      <w:hyperlink w:history="1" r:id="rIdfkshxmdkrp484sm90y1xi">
+      <w:hyperlink w:history="1" r:id="rIdvckghy4qhax_njkiiah3e">
         <w:r>
           <w:rPr>
             <w:color w:val="1D4ED8"/>
@@ -14986,7 +14986,7 @@
         </w:rPr>
         <w:t xml:space="preserve">Custodio, E., 2010. Coastal aquifers of Europe: An overview. Hydrogeol. J. 18 (1), 269–280. </w:t>
       </w:r>
-      <w:hyperlink w:history="1" r:id="rIdpwtxx-srcrvk-u4o__hzk">
+      <w:hyperlink w:history="1" r:id="rIdtd_lwrbpllcrfzzjhdhzi">
         <w:r>
           <w:rPr>
             <w:color w:val="1D4ED8"/>
@@ -15053,7 +15053,7 @@
         </w:rPr>
         <w:t xml:space="preserve">Gelhar, L.W., Welty, C., Rehfeldt, K.R., 1992. A critical review of data on field-scale dispersion in aquifers. Water Resour. Res. 28 (7), 1955–1974. </w:t>
       </w:r>
-      <w:hyperlink w:history="1" r:id="rIdaa2posogtgpvcd7rzqnwf">
+      <w:hyperlink w:history="1" r:id="rIdy-kelwv-i_zv9huyfuakj">
         <w:r>
           <w:rPr>
             <w:color w:val="1D4ED8"/>
@@ -15078,7 +15078,7 @@
         </w:rPr>
         <w:t xml:space="preserve">GLOBE Task Team and others (Hastings, D.A., Dunbar, P.K., Elphingstone, G.M., Bootz, M., Murakami, H., Maruyama, H., Masaharu, H., Holland, P., Payne, J., Bryant, N.A., Logan, T.L., Muller, J.-P., Schreier, G., MacDonald, J.S.), eds., 1999. The Global Land One-kilometer Base Elevation (GLOBE) Digital Elevation Model, Version 1.0. National Oceanic and Atmospheric Administration, National Geophysical Data Center, Boulder, Colorado. </w:t>
       </w:r>
-      <w:hyperlink w:history="1" r:id="rIda511jmobyyn8npy8gkjo0">
+      <w:hyperlink w:history="1" r:id="rIdmrdkrwnbjkvxeqqwo1xbi">
         <w:r>
           <w:rPr>
             <w:color w:val="1D4ED8"/>
@@ -15103,7 +15103,7 @@
         </w:rPr>
         <w:t xml:space="preserve">Grünwald, P., van Ommen, T., 2017. Inconsistency of Bayesian inference for misspecified linear models, and a proposal for repairing it. Bayesian Anal. 12 (4), 1069–1103. </w:t>
       </w:r>
-      <w:hyperlink w:history="1" r:id="rIdtyupnqzumv6d80rc25jgm">
+      <w:hyperlink w:history="1" r:id="rIdxmxjmuc4ji8ow8ucrdlnk">
         <w:r>
           <w:rPr>
             <w:color w:val="1D4ED8"/>
@@ -15128,7 +15128,7 @@
         </w:rPr>
         <w:t xml:space="preserve">Hänggi, P., Talkner, P., Borkovec, M., 1990. Reaction-rate theory: Fifty years after Kramers. Rev. Mod. Phys. 62 (2), 251–341. </w:t>
       </w:r>
-      <w:hyperlink w:history="1" r:id="rIdaldz5jwdg7074zamua-h2">
+      <w:hyperlink w:history="1" r:id="rId_jvnxm-zjbu-soofud0ik">
         <w:r>
           <w:rPr>
             <w:color w:val="1D4ED8"/>
@@ -15167,7 +15167,7 @@
         </w:rPr>
         <w:t xml:space="preserve">Huan, X., Jagalur, J., Marzouk, Y., 2024. Optimal experimental design: Formulations and computations. Acta Numer. 33, 715–840. </w:t>
       </w:r>
-      <w:hyperlink w:history="1" r:id="rId12ojoqbzfjzcam-2xksbz">
+      <w:hyperlink w:history="1" r:id="rIdrntiwgxuarc-avejyydxo">
         <w:r>
           <w:rPr>
             <w:color w:val="1D4ED8"/>
@@ -15192,7 +15192,7 @@
         </w:rPr>
         <w:t xml:space="preserve">Ketabchi, H., Mahmoodzadeh, D., Ataie-Ashtiani, B., Simmons, C.T., 2016. Sea-level rise impacts on seawater intrusion in coastal aquifers: Review and integration. J. Hydrol. 535, 235–255. </w:t>
       </w:r>
-      <w:hyperlink w:history="1" r:id="rIdyrecafbsu5ezstajqppsl">
+      <w:hyperlink w:history="1" r:id="rIdmluphro_eks4krubbtjlm">
         <w:r>
           <w:rPr>
             <w:color w:val="1D4ED8"/>
@@ -15217,7 +15217,7 @@
         </w:rPr>
         <w:t xml:space="preserve">Kooi, H., Groen, J., Leijnse, A., 2000. Modes of seawater intrusion during transgressions. Water Resour. Res. 36 (12), 3581–3589. </w:t>
       </w:r>
-      <w:hyperlink w:history="1" r:id="rIdi_qdxio6w4o8yzytegrcz">
+      <w:hyperlink w:history="1" r:id="rId6idlwoqql7dfevgg4dza9">
         <w:r>
           <w:rPr>
             <w:color w:val="1D4ED8"/>
@@ -15242,7 +15242,7 @@
         </w:rPr>
         <w:t xml:space="preserve">Kramers, H.A., 1940. Brownian motion in a field of force and the diffusion model of chemical reactions. Physica 7 (4), 284–304. </w:t>
       </w:r>
-      <w:hyperlink w:history="1" r:id="rId8n0gscjqtajfqrqifzul5">
+      <w:hyperlink w:history="1" r:id="rIdhyankemor6g9gatwzswtl">
         <w:r>
           <w:rPr>
             <w:color w:val="1D4ED8"/>
@@ -15267,7 +15267,7 @@
         </w:rPr>
         <w:t xml:space="preserve">Kumanova, X., Marku, S., Fröjdö, S., Jacks, G., 2014. Recharge and sustainability of a coastal aquifer in northern Albania. Hydrogeol. J. 22, 883–892. </w:t>
       </w:r>
-      <w:hyperlink w:history="1" r:id="rIdsycbpvcura-z1pbgiwdsm">
+      <w:hyperlink w:history="1" r:id="rIdghbbahwa0kqxevomzy3ky">
         <w:r>
           <w:rPr>
             <w:color w:val="1D4ED8"/>
@@ -15292,7 +15292,7 @@
         </w:rPr>
         <w:t xml:space="preserve">Lal, A., Datta, B., 2019. Application of monitoring network design and feedback information for adaptive management of coastal groundwater resources. Int. J. Environ. Res. Public Health 16 (22), 4365. </w:t>
       </w:r>
-      <w:hyperlink w:history="1" r:id="rIduyuuuqr-lvxv_t6ryqbww">
+      <w:hyperlink w:history="1" r:id="rIdwhfebh45gaebqev76nhq1">
         <w:r>
           <w:rPr>
             <w:color w:val="1D4ED8"/>
@@ -15317,7 +15317,7 @@
         </w:rPr>
         <w:t xml:space="preserve">Lindley, D.V., 1956. On a measure of the information provided by an experiment. Ann. Math. Stat. 27 (4), 986–1005. </w:t>
       </w:r>
-      <w:hyperlink w:history="1" r:id="rIdyb_tck1avtzv_9keknqwp">
+      <w:hyperlink w:history="1" r:id="rId_zzsdkr3l3vzdgh0a3wdd">
         <w:r>
           <w:rPr>
             <w:color w:val="1D4ED8"/>
@@ -15342,7 +15342,7 @@
         </w:rPr>
         <w:t xml:space="preserve">Lu, C., Werner, A.D., 2013. Timescales of seawater intrusion and retreat. Adv. Water Resour. 59, 39–51. </w:t>
       </w:r>
-      <w:hyperlink w:history="1" r:id="rIdzealwm069kicgzrzyhzgu">
+      <w:hyperlink w:history="1" r:id="rIda4o28wnanv4dyl68rtejn">
         <w:r>
           <w:rPr>
             <w:color w:val="1D4ED8"/>
@@ -15367,7 +15367,7 @@
         </w:rPr>
         <w:t xml:space="preserve">Mantoglou, A., 2003. Pumping management of coastal aquifers using analytical models of saltwater intrusion. Water Resour. Res. 39 (12), 1335. </w:t>
       </w:r>
-      <w:hyperlink w:history="1" r:id="rId_e3v57qtaqgisjybfi4eb">
+      <w:hyperlink w:history="1" r:id="rIdnkcp31qu-67gyo4q05ny1">
         <w:r>
           <w:rPr>
             <w:color w:val="1D4ED8"/>
@@ -15406,7 +15406,7 @@
         </w:rPr>
         <w:t xml:space="preserve">Millero, F.J., Feistel, R., Wright, D.G., McDougall, T.J., 2008. The composition of Standard Seawater and the definition of the Reference-Composition Salinity Scale. Deep Sea Res. Part I Oceanogr. Res. Pap. 55 (1), 50–72. </w:t>
       </w:r>
-      <w:hyperlink w:history="1" r:id="rIduhsczegmmucalse_pc8mp">
+      <w:hyperlink w:history="1" r:id="rIdrynhyte8iyj43sh-jai0-">
         <w:r>
           <w:rPr>
             <w:color w:val="1D4ED8"/>
@@ -15431,7 +15431,7 @@
         </w:rPr>
         <w:t xml:space="preserve">Neuberger, J.N., Alexanderian, A., van Bloemen Waanders, B., 2025. Goal oriented optimal design of infinite-dimensional Bayesian inverse problems using quadratic approximations. J. Sci. Comput. 105 (2), 55. </w:t>
       </w:r>
-      <w:hyperlink w:history="1" r:id="rId9rk5fid7fuwv0jmk_sqwi">
+      <w:hyperlink w:history="1" r:id="rId_pq2fcz06qr52ulc2wqys">
         <w:r>
           <w:rPr>
             <w:color w:val="1D4ED8"/>
@@ -15456,7 +15456,7 @@
         </w:rPr>
         <w:t xml:space="preserve">Pearl, J., 2009. Causality: Models, Reasoning, and Inference, second ed. Cambridge University Press, Cambridge. </w:t>
       </w:r>
-      <w:hyperlink w:history="1" r:id="rIdfcucin6k3k59txeiqgejy">
+      <w:hyperlink w:history="1" r:id="rIdsq3jzkyznt5tv_mizuf50">
         <w:r>
           <w:rPr>
             <w:color w:val="1D4ED8"/>
@@ -15481,7 +15481,7 @@
         </w:rPr>
         <w:t xml:space="preserve">Pool, M., Carrera, J., 2011. A correction factor to account for mixing in Ghyben-Herzberg and critical pumping rate approximations of seawater intrusion in coastal aquifers. Water Resour. Res. 47 (5), W05506. </w:t>
       </w:r>
-      <w:hyperlink w:history="1" r:id="rId1ajcckvzm0vh5b1kfmv6r">
+      <w:hyperlink w:history="1" r:id="rIdjgjehl1hxpqhprira1pyr">
         <w:r>
           <w:rPr>
             <w:color w:val="1D4ED8"/>
@@ -15506,7 +15506,7 @@
         </w:rPr>
         <w:t xml:space="preserve">Rainforth, T., Foster, A., Ivanova, D.R., Bickford Smith, F., 2024. Modern Bayesian experimental design. Stat. Sci. 39 (1), 100–114. </w:t>
       </w:r>
-      <w:hyperlink w:history="1" r:id="rId08gwp5396dck4cmsz7p2e">
+      <w:hyperlink w:history="1" r:id="rIdhujd-wshmqrfjvzbkn7um">
         <w:r>
           <w:rPr>
             <w:color w:val="1D4ED8"/>
@@ -15531,7 +15531,7 @@
         </w:rPr>
         <w:t xml:space="preserve">Revelle, R., 1941. Criteria for recognition of the sea water in ground-waters. Trans. Am. Geophys. Union 22 (3), 593–597. </w:t>
       </w:r>
-      <w:hyperlink w:history="1" r:id="rIdbfjdrn2c2gvwwbh7ndbmn">
+      <w:hyperlink w:history="1" r:id="rId7izpcvmp6k7zqs3jlex5j">
         <w:r>
           <w:rPr>
             <w:color w:val="1D4ED8"/>
@@ -15556,7 +15556,7 @@
         </w:rPr>
         <w:t xml:space="preserve">Robins, J.M., Hernán, M.A., Brumback, B., 2000. Marginal structural models and causal inference in epidemiology. Epidemiology 11 (5), 550–560. </w:t>
       </w:r>
-      <w:hyperlink w:history="1" r:id="rIdvg3pexfa96msabydbirig">
+      <w:hyperlink w:history="1" r:id="rId4yls3uqvyxr4joit7qgcq">
         <w:r>
           <w:rPr>
             <w:color w:val="1D4ED8"/>
@@ -15581,7 +15581,7 @@
         </w:rPr>
         <w:t xml:space="preserve">Rytgaard, H.C., Gerds, T.A., van der Laan, M.J., 2022. Continuous-time targeted minimum loss-based estimation of intervention-specific mean outcomes. Ann. Stat. 50 (5), 2469–2491. </w:t>
       </w:r>
-      <w:hyperlink w:history="1" r:id="rIdiobpdc3rrgipniopaxlge">
+      <w:hyperlink w:history="1" r:id="rIdxhd38wkiivbk61qkbzo5o">
         <w:r>
           <w:rPr>
             <w:color w:val="1D4ED8"/>
@@ -15606,7 +15606,7 @@
         </w:rPr>
         <w:t xml:space="preserve">Scheffer, M., Bascompte, J., Brock, W.A., Brovkin, V., Carpenter, S.R., Dakos, V., Held, H., van Nes, E.H., Rietkerk, M., Sugihara, G., 2009. Early-warning signals for critical transitions. Nature 461 (7260), 53–59. </w:t>
       </w:r>
-      <w:hyperlink w:history="1" r:id="rIdbqtmfp9zmjcnn8dkbccjb">
+      <w:hyperlink w:history="1" r:id="rIdbejilyqgimjxwl_ozkolf">
         <w:r>
           <w:rPr>
             <w:color w:val="1D4ED8"/>
@@ -15631,7 +15631,7 @@
         </w:rPr>
         <w:t xml:space="preserve">Schreiber, T., 2000. Measuring information transfer. Phys. Rev. Lett. 85 (2), 461–464. </w:t>
       </w:r>
-      <w:hyperlink w:history="1" r:id="rIdjvzvxxlpgdfxzcledg1rn">
+      <w:hyperlink w:history="1" r:id="rIdta0w0gugzmo0iaddwxkty">
         <w:r>
           <w:rPr>
             <w:color w:val="1D4ED8"/>
@@ -15656,7 +15656,7 @@
         </w:rPr>
         <w:t xml:space="preserve">Sreekanth, J., Datta, B., 2010. Multi-objective management of saltwater intrusion in coastal aquifers using genetic programming and modular neural network based surrogate models. J. Hydrol. 393 (3–4), 245–256. </w:t>
       </w:r>
-      <w:hyperlink w:history="1" r:id="rIdjrxhuhsoy-6xbstarsssq">
+      <w:hyperlink w:history="1" r:id="rId6icqxo0mgcknizrzbrkrr">
         <w:r>
           <w:rPr>
             <w:color w:val="1D4ED8"/>
@@ -15681,7 +15681,7 @@
         </w:rPr>
         <w:t xml:space="preserve">Strack, O.D.L., 1976. A single-potential solution for regional interface problems in coastal aquifers. Water Resour. Res. 12 (6), 1165–1174. </w:t>
       </w:r>
-      <w:hyperlink w:history="1" r:id="rIdxt90wr0oozukowp3awohh">
+      <w:hyperlink w:history="1" r:id="rIdayruc36bsckvw77bma_ql">
         <w:r>
           <w:rPr>
             <w:color w:val="1D4ED8"/>
@@ -15720,7 +15720,7 @@
         </w:rPr>
         <w:t xml:space="preserve">Syring, N., Martin, R., 2019. Calibrating general posterior credible regions. Biometrika 106 (2), 479–486. </w:t>
       </w:r>
-      <w:hyperlink w:history="1" r:id="rIdxkljtd3ef4rq7-mwmwzfu">
+      <w:hyperlink w:history="1" r:id="rIdaptzf2s_qtvgt6nvweksr">
         <w:r>
           <w:rPr>
             <w:color w:val="1D4ED8"/>
@@ -15745,7 +15745,7 @@
         </w:rPr>
         <w:t xml:space="preserve">Tian, J., Pearl, J., 2000. Probabilities of causation: Bounds and identification. Ann. Math. Artif. Intell. 28, 287–313. </w:t>
       </w:r>
-      <w:hyperlink w:history="1" r:id="rIdpaczqdrgmaafqqagolipl">
+      <w:hyperlink w:history="1" r:id="rIdcjce1_cksbmzo2rvjca4s">
         <w:r>
           <w:rPr>
             <w:color w:val="1D4ED8"/>
@@ -15770,7 +15770,7 @@
         </w:rPr>
         <w:t xml:space="preserve">van der Laan, M.J., Rose, S., 2011. Targeted Learning: Causal Inference for Observational and Experimental Data. Springer, New York. </w:t>
       </w:r>
-      <w:hyperlink w:history="1" r:id="rIdpwlbmsgyplvsq5xwu-y_j">
+      <w:hyperlink w:history="1" r:id="rIdzm8z5ipzlwbet9h0ntz_o">
         <w:r>
           <w:rPr>
             <w:color w:val="1D4ED8"/>
@@ -15795,7 +15795,7 @@
         </w:rPr>
         <w:t xml:space="preserve">Werner, A.D., Bakker, M., Post, V.E.A., Vandenbohede, A., Lu, C., Ataie-Ashtiani, B., Simmons, C.T., Barry, D.A., 2013. Seawater intrusion processes, investigation and management: Recent advances and future challenges. Adv. Water Resour. 51, 3–26. </w:t>
       </w:r>
-      <w:hyperlink w:history="1" r:id="rIdra48drkghrfiswox0xavo">
+      <w:hyperlink w:history="1" r:id="rIdhxwwu92-pfcghm_txm75t">
         <w:r>
           <w:rPr>
             <w:color w:val="1D4ED8"/>
@@ -15820,7 +15820,7 @@
         </w:rPr>
         <w:t xml:space="preserve">Williams, P.L., Beer, R.D., 2010. Nonnegative decomposition of multivariate information. arXiv preprint arXiv:1004.2515. </w:t>
       </w:r>
-      <w:hyperlink w:history="1" r:id="rIdzavvordkvrbgdpoez7i6x">
+      <w:hyperlink w:history="1" r:id="rIdzjd1thm9jps5hqpbjd-ps">
         <w:r>
           <w:rPr>
             <w:color w:val="1D4ED8"/>
@@ -15859,7 +15859,7 @@
         </w:rPr>
         <w:t xml:space="preserve">Zeqiraj, D., 2026. Goal-oriented Bayesian experimental design for variable-density seawater intrusion: Adjoint expected information gain for joint monitoring and managed-aquifer-recharge placement. J. Hydrol. 680, 136559. </w:t>
       </w:r>
-      <w:hyperlink w:history="1" r:id="rId3hrulfv0pwgydwsv78tlo">
+      <w:hyperlink w:history="1" r:id="rIdpfildxixqgwirap_t79xi">
         <w:r>
           <w:rPr>
             <w:color w:val="1D4ED8"/>

</xml_diff>

<commit_message>
PRAG-GO MATLAB port verified on all budgets; manuscript and Supplement updated
Full Octave 8.4 run of fkcl_prag_go: the 2-, 3- and 5-well optima and every
criterion's percentage match fk_prag_geo.py (largest difference 4.4e-6).
Run times in the docstring and README are the measured Octave ones (about
8 min for 2 and 3 wells, about 55 min more for 5 wells, one core).

Manuscript Section 3.7 and Supplement S7, S7.2b, S8 and Table S9 now name
fkcl_prag_go.m; the package count is 34 functions.

Co-Authored-By: Claude Opus 5.5 <noreply@anthropic.com>
Claude-Session: https://claude.ai/code/session_016Cdcj2FTAQGBVsJUyYJR2M
</commit_message>
<xml_diff>
--- a/docs/manuscript/Chloride_Fushe_Kuqe_Manuscript.docx
+++ b/docs/manuscript/Chloride_Fushe_Kuqe_Manuscript.docx
@@ -7023,7 +7023,7 @@
         <w:jc w:val="both"/>
       </w:pPr>
       <w:r>
-        <w:t xml:space="preserve">The chloride study is implemented twice. The MATLAB package (chloride_fk/matlab, 32 functions, base MATLAB only, written for R2026b) reads the workbook with readcell, runs the calibration, posterior, design and sections, and draws Figs. 1–8 with exportgraphics; fkcl_run_all reproduces everything and fkcl_selftest runs six checks (screen-average closed form, continuity of the Strack branches, the EIG closed form, the Henry ladder, the hydrochemical indices and agreement with the reference implementation). A Python implementation, written first, rendered the figures shown here. Given the same random draws, the two agree to a relative difference of 10⁻⁷ on 500 × 15 calibration summaries, and the MATLAB run reproduces the effective sample size (3249) and the posterior areas to the reported digits. The full MATLAB run takes about 4 min without the sections and 10–20 min with them; the decision modules were implemented in Python (experiments/ folder of the repository).</w:t>
+        <w:t xml:space="preserve">The chloride study is implemented twice. The MATLAB package (chloride_fk/matlab, 34 functions, base MATLAB only, written for R2026b) reads the workbook with readcell, runs the calibration, posterior, design and sections, and draws Figs. 1–8 with exportgraphics; fkcl_run_all reproduces everything and fkcl_selftest runs six checks (screen-average closed form, continuity of the Strack branches, the EIG closed form, the Henry ladder, the hydrochemical indices and agreement with the reference implementation). A Python implementation, written first, rendered the figures shown here. Given the same random draws, the two agree to a relative difference of 10⁻⁷ on 500 × 15 calibration summaries, and the MATLAB run reproduces the effective sample size (3249) and the posterior areas to the reported digits. The full MATLAB run takes about 4 min without the sections and 10–20 min with them; the decision modules were implemented in Python (experiments/ folder of the repository), and PRAG-MAR and PRAG-GO with the geolocated sea boundary also in MATLAB (fkcl_prag_mar, fkcl_prag_go), which reproduce the Python results from the same random draws.</w:t>
       </w:r>
     </w:p>
     <w:p>
@@ -14643,7 +14643,7 @@
       <w:r>
         <w:t xml:space="preserve">The data workbook (aquifer polygon, well list, hydraulic conductivities, DRASTIC parameters and the compiled water chemistry) is the property of the Albanian Geological Survey and A. Beqiraj and is redistributed with their permission in the code repository; the water-chemistry data are published in Cenameri and Beqiraj (2016). The MATLAB and Python code, the derived inputs and all results are available at </w:t>
       </w:r>
-      <w:hyperlink w:history="1" r:id="rId5lusyreoxm75-3wneawam">
+      <w:hyperlink w:history="1" r:id="rId9whhhnw_1iiiz8gzf_mjd">
         <w:r>
           <w:rPr>
             <w:color w:val="1D4ED8"/>
@@ -14747,7 +14747,7 @@
         </w:rPr>
         <w:t xml:space="preserve">Abarca, E., Carrera, J., Sánchez-Vila, X., Dentz, M., 2007. Anisotropic dispersive Henry problem. Adv. Water Resour. 30 (4), 913–926. </w:t>
       </w:r>
-      <w:hyperlink w:history="1" r:id="rIdhlbpo6hnm1oc8ykmpnhy8">
+      <w:hyperlink w:history="1" r:id="rIdoimfnmylikx918tlvrzve">
         <w:r>
           <w:rPr>
             <w:color w:val="1D4ED8"/>
@@ -14772,7 +14772,7 @@
         </w:rPr>
         <w:t xml:space="preserve">Alexanderian, A., 2021. Optimal experimental design for infinite-dimensional Bayesian inverse problems governed by PDEs: A review. Inverse Probl. 37 (4), 043001. </w:t>
       </w:r>
-      <w:hyperlink w:history="1" r:id="rIdtsqxkhuea7-no0pndvkkq">
+      <w:hyperlink w:history="1" r:id="rIdretthbbrv7y7-oofuo8tm">
         <w:r>
           <w:rPr>
             <w:color w:val="1D4ED8"/>
@@ -14811,7 +14811,7 @@
         </w:rPr>
         <w:t xml:space="preserve">Appelo, C.A.J., Postma, D., 2005. Geochemistry, Groundwater and Pollution, second ed. A.A. Balkema, Leiden. </w:t>
       </w:r>
-      <w:hyperlink w:history="1" r:id="rIdnfiui5yvwxmy2tfbygylv">
+      <w:hyperlink w:history="1" r:id="rId8-ehhrft0adnht6_zvaxu">
         <w:r>
           <w:rPr>
             <w:color w:val="1D4ED8"/>
@@ -14836,7 +14836,7 @@
         </w:rPr>
         <w:t xml:space="preserve">Artegiani, A., Bregant, D., Paschini, E., Pinardi, N., Raicich, F., Russo, A., 1997. The Adriatic Sea general circulation. Part I: Air–sea interactions and water mass structure. J. Phys. Oceanogr. 27 (8), 1492–1514. </w:t>
       </w:r>
-      <w:hyperlink w:history="1" r:id="rIdrvnf54n4ecbnmsmc6jz3u">
+      <w:hyperlink w:history="1" r:id="rIdvi1bnomrlodygupvtytie">
         <w:r>
           <w:rPr>
             <w:color w:val="1D4ED8"/>
@@ -14861,7 +14861,7 @@
         </w:rPr>
         <w:t xml:space="preserve">Attia, A., Alexanderian, A., Saibaba, A.K., 2018. Goal-oriented optimal design of experiments for large-scale Bayesian linear inverse problems. Inverse Probl. 34 (9), 095009. </w:t>
       </w:r>
-      <w:hyperlink w:history="1" r:id="rIdffjdddl4nzmdzkigmqe3i">
+      <w:hyperlink w:history="1" r:id="rIdut017wu7pqso1_fjqbtp5">
         <w:r>
           <w:rPr>
             <w:color w:val="1D4ED8"/>
@@ -14886,7 +14886,7 @@
         </w:rPr>
         <w:t xml:space="preserve">Ay, N., Polani, D., 2008. Information flows in causal networks. Adv. Complex Syst. 11 (1), 17–41. </w:t>
       </w:r>
-      <w:hyperlink w:history="1" r:id="rId58qfpy3j1squvygkri_im">
+      <w:hyperlink w:history="1" r:id="rIdlzrdryacudjlxv2u33ypo">
         <w:r>
           <w:rPr>
             <w:color w:val="1D4ED8"/>
@@ -14911,7 +14911,7 @@
         </w:rPr>
         <w:t xml:space="preserve">Bertschinger, N., Rauh, J., Olbrich, E., Jost, J., Ay, N., 2014. Quantifying unique information. Entropy 16 (4), 2161–2183. </w:t>
       </w:r>
-      <w:hyperlink w:history="1" r:id="rId9s3c9pd0jnaknonho9a0z">
+      <w:hyperlink w:history="1" r:id="rIdflqfxasqffeg5q1hsn7y-">
         <w:r>
           <w:rPr>
             <w:color w:val="1D4ED8"/>
@@ -14936,7 +14936,7 @@
         </w:rPr>
         <w:t xml:space="preserve">Cenameri, S., Beqiraj, A., 2016. Assessment of seawater intrusion in Fushe Kuqe aquifer, Albania. Bull. Geol. Soc. Greece 50 (2), 665–670. </w:t>
       </w:r>
-      <w:hyperlink w:history="1" r:id="rIdr5vhowf6nslhq5eit0qgq">
+      <w:hyperlink w:history="1" r:id="rIdpd9dz8zq_z-trkhldum2g">
         <w:r>
           <w:rPr>
             <w:color w:val="1D4ED8"/>
@@ -14961,7 +14961,7 @@
         </w:rPr>
         <w:t xml:space="preserve">Chaloner, K., Verdinelli, I., 1995. Bayesian experimental design: A review. Stat. Sci. 10 (3), 273–304. </w:t>
       </w:r>
-      <w:hyperlink w:history="1" r:id="rIdvckghy4qhax_njkiiah3e">
+      <w:hyperlink w:history="1" r:id="rIdgegw-vky7bzot5o8tsnze">
         <w:r>
           <w:rPr>
             <w:color w:val="1D4ED8"/>
@@ -14986,7 +14986,7 @@
         </w:rPr>
         <w:t xml:space="preserve">Custodio, E., 2010. Coastal aquifers of Europe: An overview. Hydrogeol. J. 18 (1), 269–280. </w:t>
       </w:r>
-      <w:hyperlink w:history="1" r:id="rIdtd_lwrbpllcrfzzjhdhzi">
+      <w:hyperlink w:history="1" r:id="rIdfctd2kwdo5eus2lpckqzz">
         <w:r>
           <w:rPr>
             <w:color w:val="1D4ED8"/>
@@ -15053,7 +15053,7 @@
         </w:rPr>
         <w:t xml:space="preserve">Gelhar, L.W., Welty, C., Rehfeldt, K.R., 1992. A critical review of data on field-scale dispersion in aquifers. Water Resour. Res. 28 (7), 1955–1974. </w:t>
       </w:r>
-      <w:hyperlink w:history="1" r:id="rIdy-kelwv-i_zv9huyfuakj">
+      <w:hyperlink w:history="1" r:id="rId3uxubbf_wnbj9w_qwuomz">
         <w:r>
           <w:rPr>
             <w:color w:val="1D4ED8"/>
@@ -15078,7 +15078,7 @@
         </w:rPr>
         <w:t xml:space="preserve">GLOBE Task Team and others (Hastings, D.A., Dunbar, P.K., Elphingstone, G.M., Bootz, M., Murakami, H., Maruyama, H., Masaharu, H., Holland, P., Payne, J., Bryant, N.A., Logan, T.L., Muller, J.-P., Schreier, G., MacDonald, J.S.), eds., 1999. The Global Land One-kilometer Base Elevation (GLOBE) Digital Elevation Model, Version 1.0. National Oceanic and Atmospheric Administration, National Geophysical Data Center, Boulder, Colorado. </w:t>
       </w:r>
-      <w:hyperlink w:history="1" r:id="rIdmrdkrwnbjkvxeqqwo1xbi">
+      <w:hyperlink w:history="1" r:id="rId9h40jexgppfnk9oz3jrpt">
         <w:r>
           <w:rPr>
             <w:color w:val="1D4ED8"/>
@@ -15103,7 +15103,7 @@
         </w:rPr>
         <w:t xml:space="preserve">Grünwald, P., van Ommen, T., 2017. Inconsistency of Bayesian inference for misspecified linear models, and a proposal for repairing it. Bayesian Anal. 12 (4), 1069–1103. </w:t>
       </w:r>
-      <w:hyperlink w:history="1" r:id="rIdxmxjmuc4ji8ow8ucrdlnk">
+      <w:hyperlink w:history="1" r:id="rIdpbs5ic02lwom8gum4fwdq">
         <w:r>
           <w:rPr>
             <w:color w:val="1D4ED8"/>
@@ -15128,7 +15128,7 @@
         </w:rPr>
         <w:t xml:space="preserve">Hänggi, P., Talkner, P., Borkovec, M., 1990. Reaction-rate theory: Fifty years after Kramers. Rev. Mod. Phys. 62 (2), 251–341. </w:t>
       </w:r>
-      <w:hyperlink w:history="1" r:id="rId_jvnxm-zjbu-soofud0ik">
+      <w:hyperlink w:history="1" r:id="rIdfzlq_6-abtlaquo2wpsyb">
         <w:r>
           <w:rPr>
             <w:color w:val="1D4ED8"/>
@@ -15167,7 +15167,7 @@
         </w:rPr>
         <w:t xml:space="preserve">Huan, X., Jagalur, J., Marzouk, Y., 2024. Optimal experimental design: Formulations and computations. Acta Numer. 33, 715–840. </w:t>
       </w:r>
-      <w:hyperlink w:history="1" r:id="rIdrntiwgxuarc-avejyydxo">
+      <w:hyperlink w:history="1" r:id="rIdccku99dvt4ly4kra3grmz">
         <w:r>
           <w:rPr>
             <w:color w:val="1D4ED8"/>
@@ -15192,7 +15192,7 @@
         </w:rPr>
         <w:t xml:space="preserve">Ketabchi, H., Mahmoodzadeh, D., Ataie-Ashtiani, B., Simmons, C.T., 2016. Sea-level rise impacts on seawater intrusion in coastal aquifers: Review and integration. J. Hydrol. 535, 235–255. </w:t>
       </w:r>
-      <w:hyperlink w:history="1" r:id="rIdmluphro_eks4krubbtjlm">
+      <w:hyperlink w:history="1" r:id="rIdmzrqcutgddcxwd_bkadqs">
         <w:r>
           <w:rPr>
             <w:color w:val="1D4ED8"/>
@@ -15217,7 +15217,7 @@
         </w:rPr>
         <w:t xml:space="preserve">Kooi, H., Groen, J., Leijnse, A., 2000. Modes of seawater intrusion during transgressions. Water Resour. Res. 36 (12), 3581–3589. </w:t>
       </w:r>
-      <w:hyperlink w:history="1" r:id="rId6idlwoqql7dfevgg4dza9">
+      <w:hyperlink w:history="1" r:id="rIdg5m7zirtj7nn-lihcujc2">
         <w:r>
           <w:rPr>
             <w:color w:val="1D4ED8"/>
@@ -15242,7 +15242,7 @@
         </w:rPr>
         <w:t xml:space="preserve">Kramers, H.A., 1940. Brownian motion in a field of force and the diffusion model of chemical reactions. Physica 7 (4), 284–304. </w:t>
       </w:r>
-      <w:hyperlink w:history="1" r:id="rIdhyankemor6g9gatwzswtl">
+      <w:hyperlink w:history="1" r:id="rIdm4mxe95enr5hfndbbkjy0">
         <w:r>
           <w:rPr>
             <w:color w:val="1D4ED8"/>
@@ -15267,7 +15267,7 @@
         </w:rPr>
         <w:t xml:space="preserve">Kumanova, X., Marku, S., Fröjdö, S., Jacks, G., 2014. Recharge and sustainability of a coastal aquifer in northern Albania. Hydrogeol. J. 22, 883–892. </w:t>
       </w:r>
-      <w:hyperlink w:history="1" r:id="rIdghbbahwa0kqxevomzy3ky">
+      <w:hyperlink w:history="1" r:id="rIdvybku-hjfqmeymdrzinhu">
         <w:r>
           <w:rPr>
             <w:color w:val="1D4ED8"/>
@@ -15292,7 +15292,7 @@
         </w:rPr>
         <w:t xml:space="preserve">Lal, A., Datta, B., 2019. Application of monitoring network design and feedback information for adaptive management of coastal groundwater resources. Int. J. Environ. Res. Public Health 16 (22), 4365. </w:t>
       </w:r>
-      <w:hyperlink w:history="1" r:id="rIdwhfebh45gaebqev76nhq1">
+      <w:hyperlink w:history="1" r:id="rIdh1h0mxrtxdobazcgtq4xq">
         <w:r>
           <w:rPr>
             <w:color w:val="1D4ED8"/>
@@ -15317,7 +15317,7 @@
         </w:rPr>
         <w:t xml:space="preserve">Lindley, D.V., 1956. On a measure of the information provided by an experiment. Ann. Math. Stat. 27 (4), 986–1005. </w:t>
       </w:r>
-      <w:hyperlink w:history="1" r:id="rId_zzsdkr3l3vzdgh0a3wdd">
+      <w:hyperlink w:history="1" r:id="rIdgxzdnx8-az0urw2d12fs_">
         <w:r>
           <w:rPr>
             <w:color w:val="1D4ED8"/>
@@ -15342,7 +15342,7 @@
         </w:rPr>
         <w:t xml:space="preserve">Lu, C., Werner, A.D., 2013. Timescales of seawater intrusion and retreat. Adv. Water Resour. 59, 39–51. </w:t>
       </w:r>
-      <w:hyperlink w:history="1" r:id="rIda4o28wnanv4dyl68rtejn">
+      <w:hyperlink w:history="1" r:id="rIdiql2e1psebyikukszw6af">
         <w:r>
           <w:rPr>
             <w:color w:val="1D4ED8"/>
@@ -15367,7 +15367,7 @@
         </w:rPr>
         <w:t xml:space="preserve">Mantoglou, A., 2003. Pumping management of coastal aquifers using analytical models of saltwater intrusion. Water Resour. Res. 39 (12), 1335. </w:t>
       </w:r>
-      <w:hyperlink w:history="1" r:id="rIdnkcp31qu-67gyo4q05ny1">
+      <w:hyperlink w:history="1" r:id="rId2_rumdhax297_4vjrquut">
         <w:r>
           <w:rPr>
             <w:color w:val="1D4ED8"/>
@@ -15406,7 +15406,7 @@
         </w:rPr>
         <w:t xml:space="preserve">Millero, F.J., Feistel, R., Wright, D.G., McDougall, T.J., 2008. The composition of Standard Seawater and the definition of the Reference-Composition Salinity Scale. Deep Sea Res. Part I Oceanogr. Res. Pap. 55 (1), 50–72. </w:t>
       </w:r>
-      <w:hyperlink w:history="1" r:id="rIdrynhyte8iyj43sh-jai0-">
+      <w:hyperlink w:history="1" r:id="rIdbrxws-9h66y6bue8kwywl">
         <w:r>
           <w:rPr>
             <w:color w:val="1D4ED8"/>
@@ -15431,7 +15431,7 @@
         </w:rPr>
         <w:t xml:space="preserve">Neuberger, J.N., Alexanderian, A., van Bloemen Waanders, B., 2025. Goal oriented optimal design of infinite-dimensional Bayesian inverse problems using quadratic approximations. J. Sci. Comput. 105 (2), 55. </w:t>
       </w:r>
-      <w:hyperlink w:history="1" r:id="rId_pq2fcz06qr52ulc2wqys">
+      <w:hyperlink w:history="1" r:id="rIdfiwpecfz2xpfzawvqhx9w">
         <w:r>
           <w:rPr>
             <w:color w:val="1D4ED8"/>
@@ -15456,7 +15456,7 @@
         </w:rPr>
         <w:t xml:space="preserve">Pearl, J., 2009. Causality: Models, Reasoning, and Inference, second ed. Cambridge University Press, Cambridge. </w:t>
       </w:r>
-      <w:hyperlink w:history="1" r:id="rIdsq3jzkyznt5tv_mizuf50">
+      <w:hyperlink w:history="1" r:id="rIdvxlieuey6ya7hvlmiv_te">
         <w:r>
           <w:rPr>
             <w:color w:val="1D4ED8"/>
@@ -15481,7 +15481,7 @@
         </w:rPr>
         <w:t xml:space="preserve">Pool, M., Carrera, J., 2011. A correction factor to account for mixing in Ghyben-Herzberg and critical pumping rate approximations of seawater intrusion in coastal aquifers. Water Resour. Res. 47 (5), W05506. </w:t>
       </w:r>
-      <w:hyperlink w:history="1" r:id="rIdjgjehl1hxpqhprira1pyr">
+      <w:hyperlink w:history="1" r:id="rIdy56ffnlqtdkq276gmor6e">
         <w:r>
           <w:rPr>
             <w:color w:val="1D4ED8"/>
@@ -15506,7 +15506,7 @@
         </w:rPr>
         <w:t xml:space="preserve">Rainforth, T., Foster, A., Ivanova, D.R., Bickford Smith, F., 2024. Modern Bayesian experimental design. Stat. Sci. 39 (1), 100–114. </w:t>
       </w:r>
-      <w:hyperlink w:history="1" r:id="rIdhujd-wshmqrfjvzbkn7um">
+      <w:hyperlink w:history="1" r:id="rIdqkiywpdlivuicppo8iqft">
         <w:r>
           <w:rPr>
             <w:color w:val="1D4ED8"/>
@@ -15531,7 +15531,7 @@
         </w:rPr>
         <w:t xml:space="preserve">Revelle, R., 1941. Criteria for recognition of the sea water in ground-waters. Trans. Am. Geophys. Union 22 (3), 593–597. </w:t>
       </w:r>
-      <w:hyperlink w:history="1" r:id="rId7izpcvmp6k7zqs3jlex5j">
+      <w:hyperlink w:history="1" r:id="rIdqb9soxzjujptqgih5xs_v">
         <w:r>
           <w:rPr>
             <w:color w:val="1D4ED8"/>
@@ -15556,7 +15556,7 @@
         </w:rPr>
         <w:t xml:space="preserve">Robins, J.M., Hernán, M.A., Brumback, B., 2000. Marginal structural models and causal inference in epidemiology. Epidemiology 11 (5), 550–560. </w:t>
       </w:r>
-      <w:hyperlink w:history="1" r:id="rId4yls3uqvyxr4joit7qgcq">
+      <w:hyperlink w:history="1" r:id="rIdj8xtzm8kcziieixhxqf_j">
         <w:r>
           <w:rPr>
             <w:color w:val="1D4ED8"/>
@@ -15581,7 +15581,7 @@
         </w:rPr>
         <w:t xml:space="preserve">Rytgaard, H.C., Gerds, T.A., van der Laan, M.J., 2022. Continuous-time targeted minimum loss-based estimation of intervention-specific mean outcomes. Ann. Stat. 50 (5), 2469–2491. </w:t>
       </w:r>
-      <w:hyperlink w:history="1" r:id="rIdxhd38wkiivbk61qkbzo5o">
+      <w:hyperlink w:history="1" r:id="rIdmnxkgflaabovzraskgw4d">
         <w:r>
           <w:rPr>
             <w:color w:val="1D4ED8"/>
@@ -15606,7 +15606,7 @@
         </w:rPr>
         <w:t xml:space="preserve">Scheffer, M., Bascompte, J., Brock, W.A., Brovkin, V., Carpenter, S.R., Dakos, V., Held, H., van Nes, E.H., Rietkerk, M., Sugihara, G., 2009. Early-warning signals for critical transitions. Nature 461 (7260), 53–59. </w:t>
       </w:r>
-      <w:hyperlink w:history="1" r:id="rIdbejilyqgimjxwl_ozkolf">
+      <w:hyperlink w:history="1" r:id="rIdz1yafiqcxlfa4bmri4qti">
         <w:r>
           <w:rPr>
             <w:color w:val="1D4ED8"/>
@@ -15631,7 +15631,7 @@
         </w:rPr>
         <w:t xml:space="preserve">Schreiber, T., 2000. Measuring information transfer. Phys. Rev. Lett. 85 (2), 461–464. </w:t>
       </w:r>
-      <w:hyperlink w:history="1" r:id="rIdta0w0gugzmo0iaddwxkty">
+      <w:hyperlink w:history="1" r:id="rIdn16i-s--tcgsx-wmwfaur">
         <w:r>
           <w:rPr>
             <w:color w:val="1D4ED8"/>
@@ -15656,7 +15656,7 @@
         </w:rPr>
         <w:t xml:space="preserve">Sreekanth, J., Datta, B., 2010. Multi-objective management of saltwater intrusion in coastal aquifers using genetic programming and modular neural network based surrogate models. J. Hydrol. 393 (3–4), 245–256. </w:t>
       </w:r>
-      <w:hyperlink w:history="1" r:id="rId6icqxo0mgcknizrzbrkrr">
+      <w:hyperlink w:history="1" r:id="rId7do7ssesr7anhsheci8xi">
         <w:r>
           <w:rPr>
             <w:color w:val="1D4ED8"/>
@@ -15681,7 +15681,7 @@
         </w:rPr>
         <w:t xml:space="preserve">Strack, O.D.L., 1976. A single-potential solution for regional interface problems in coastal aquifers. Water Resour. Res. 12 (6), 1165–1174. </w:t>
       </w:r>
-      <w:hyperlink w:history="1" r:id="rIdayruc36bsckvw77bma_ql">
+      <w:hyperlink w:history="1" r:id="rIdcarp7et3jrl44-d8qvj9l">
         <w:r>
           <w:rPr>
             <w:color w:val="1D4ED8"/>
@@ -15720,7 +15720,7 @@
         </w:rPr>
         <w:t xml:space="preserve">Syring, N., Martin, R., 2019. Calibrating general posterior credible regions. Biometrika 106 (2), 479–486. </w:t>
       </w:r>
-      <w:hyperlink w:history="1" r:id="rIdaptzf2s_qtvgt6nvweksr">
+      <w:hyperlink w:history="1" r:id="rIdfrkjjssmxgcrtdlwrglf5">
         <w:r>
           <w:rPr>
             <w:color w:val="1D4ED8"/>
@@ -15745,7 +15745,7 @@
         </w:rPr>
         <w:t xml:space="preserve">Tian, J., Pearl, J., 2000. Probabilities of causation: Bounds and identification. Ann. Math. Artif. Intell. 28, 287–313. </w:t>
       </w:r>
-      <w:hyperlink w:history="1" r:id="rIdcjce1_cksbmzo2rvjca4s">
+      <w:hyperlink w:history="1" r:id="rIdwsvgq9cc6zsnpct5tciy6">
         <w:r>
           <w:rPr>
             <w:color w:val="1D4ED8"/>
@@ -15770,7 +15770,7 @@
         </w:rPr>
         <w:t xml:space="preserve">van der Laan, M.J., Rose, S., 2011. Targeted Learning: Causal Inference for Observational and Experimental Data. Springer, New York. </w:t>
       </w:r>
-      <w:hyperlink w:history="1" r:id="rIdzm8z5ipzlwbet9h0ntz_o">
+      <w:hyperlink w:history="1" r:id="rId9uqh4y4xbgwpn5booqmy_">
         <w:r>
           <w:rPr>
             <w:color w:val="1D4ED8"/>
@@ -15795,7 +15795,7 @@
         </w:rPr>
         <w:t xml:space="preserve">Werner, A.D., Bakker, M., Post, V.E.A., Vandenbohede, A., Lu, C., Ataie-Ashtiani, B., Simmons, C.T., Barry, D.A., 2013. Seawater intrusion processes, investigation and management: Recent advances and future challenges. Adv. Water Resour. 51, 3–26. </w:t>
       </w:r>
-      <w:hyperlink w:history="1" r:id="rIdhxwwu92-pfcghm_txm75t">
+      <w:hyperlink w:history="1" r:id="rIdccgqab4owp8adbu_cmbqy">
         <w:r>
           <w:rPr>
             <w:color w:val="1D4ED8"/>
@@ -15820,7 +15820,7 @@
         </w:rPr>
         <w:t xml:space="preserve">Williams, P.L., Beer, R.D., 2010. Nonnegative decomposition of multivariate information. arXiv preprint arXiv:1004.2515. </w:t>
       </w:r>
-      <w:hyperlink w:history="1" r:id="rIdzjd1thm9jps5hqpbjd-ps">
+      <w:hyperlink w:history="1" r:id="rIdgzu_duky8yjqkfoov0nom">
         <w:r>
           <w:rPr>
             <w:color w:val="1D4ED8"/>
@@ -15859,7 +15859,7 @@
         </w:rPr>
         <w:t xml:space="preserve">Zeqiraj, D., 2026. Goal-oriented Bayesian experimental design for variable-density seawater intrusion: Adjoint expected information gain for joint monitoring and managed-aquifer-recharge placement. J. Hydrol. 680, 136559. </w:t>
       </w:r>
-      <w:hyperlink w:history="1" r:id="rIdpfildxixqgwirap_t79xi">
+      <w:hyperlink w:history="1" r:id="rIdskgvmacaaaiz0c-sbwt_b">
         <w:r>
           <w:rPr>
             <w:color w:val="1D4ED8"/>

</xml_diff>